<commit_message>
Laborator Cesta dat siti do banky (1L/2, hodina 4)
- presun z navrhy/ do Podklady k aktivitam, anglicky nazev v materials.ts
- modul 07 (ipconfig, nslookup, tracert, ping) oznacen jako bonus k hodine 6,
  plan hodiny 4 prikazovy radek zatim zakazuje
- plan hodiny 4: laborator v pomuckach a metodicka poznamka, jak ji zaradit

Co-Authored-By: Claude Opus 5.5 <noreply@anthropic.com>
Claude-Session: https://claude.ai/code/session_01QhSRJEZwDnvy4KLvEMivYU
</commit_message>
<xml_diff>
--- a/public/materialy/1L/2/_ucitel/4. Počítačové sítě - plán hodiny.docx
+++ b/public/materialy/1L/2/_ucitel/4. Počítačové sítě - plán hodiny.docx
@@ -564,6 +564,19 @@
       </w:pPr>
       <w:r>
         <w:t>Vytištěný pracovní list — 1 ks na žáka.</w:t>
+      </w:r>
+    </w:p>
+    <w:p>
+      <w:pPr>
+        <w:pStyle w:val="Odstavecseseznamem"/>
+        <w:numPr>
+          <w:ilvl w:val="0"/>
+          <w:numId w:val="2"/>
+        </w:numPr>
+        <w:spacing w:after="40"/>
+      </w:pPr>
+      <w:r>
+        <w:t xml:space="preserve">Laboratoř – cesta dat sítí (banka → Podklady k aktivitám) — na dataprojektor i pro žáky, funguje bez internetu.</w:t>
       </w:r>
     </w:p>
     <w:p>
@@ -1611,6 +1624,26 @@
       </w:r>
       <w:r>
         <w:t>Modely OSI, TCP/UDP, masky sítě sem nepatří — cílem je správná základní představa. Zvídavé odkaž na bonus a další ročníky.</w:t>
+      </w:r>
+    </w:p>
+    <w:p>
+      <w:pPr>
+        <w:pStyle w:val="Odstavecseseznamem"/>
+        <w:numPr>
+          <w:ilvl w:val="0"/>
+          <w:numId w:val="2"/>
+        </w:numPr>
+        <w:spacing w:after="40"/>
+      </w:pPr>
+      <w:r>
+        <w:rPr>
+          <w:b/>
+          <w:bCs/>
+        </w:rPr>
+        <w:t xml:space="preserve">Laboratoř navazuje na hru, nenahrazuje ji. </w:t>
+      </w:r>
+      <w:r>
+        <w:t xml:space="preserve">Po hře promítni moduly 01–05 a projděte cestu dat po krocích. Modul 06 je bonus pro rychlíky (vnitřní × veřejná adresa), modul 07 s příkazy patří až k hodině 6.</w:t>
       </w:r>
     </w:p>
     <w:p>

</xml_diff>